<commit_message>
feat: process DOCX table paragraphs
</commit_message>
<xml_diff>
--- a/fixtures/labeled/contract_04_bankruptcy.docx
+++ b/fixtures/labeled/contract_04_bankruptcy.docx
@@ -71,11 +71,20 @@
           <w:p>
             <w:r>
               <w:t>Продавец: Сидорова Анна Петровна</w:t>
-              <w:br/>
+            </w:r>
+          </w:p>
+          <w:p>
+            <w:r>
               <w:t>СНИЛС 112-233-445 95</w:t>
-              <w:br/>
+            </w:r>
+          </w:p>
+          <w:p>
+            <w:r>
               <w:t>ИНН 500100732259</w:t>
-              <w:br/>
+            </w:r>
+          </w:p>
+          <w:p>
+            <w:r>
               <w:t>Адрес: 302000, г. Орёл, ул. Лесная, д. 7</w:t>
             </w:r>
           </w:p>
@@ -87,11 +96,20 @@
           <w:p>
             <w:r>
               <w:t>Покупатель: ______</w:t>
-              <w:br/>
+            </w:r>
+          </w:p>
+          <w:p>
+            <w:r>
               <w:t>Паспорт: ______</w:t>
-              <w:br/>
+            </w:r>
+          </w:p>
+          <w:p>
+            <w:r>
               <w:t>Адрес: ______</w:t>
-              <w:br/>
+            </w:r>
+          </w:p>
+          <w:p>
+            <w:r>
               <w:t>Подпись: ______</w:t>
             </w:r>
           </w:p>

</xml_diff>